<commit_message>
feat: regenerate BIM docx templates with real consulting content
propuesta_bim.docx: cover page, executive summary, LOD table (200/300/400),
deliverables by phase, team table, schedule, investment breakdown, conditions,
signature block

cotizacion_bim.docx: company header, client data, service detail table (5 items),
subtotal/IVA/total, payment conditions, acceptance and signatures

Co-authored-by: David Moreira <UmbralBIM@users.noreply.github.com>
</commit_message>
<xml_diff>
--- a/worker/templates/documents/cotizacion_bim.docx
+++ b/worker/templates/documents/cotizacion_bim.docx
@@ -2,6 +2,31 @@
 <file path=word/document.xml><?xml version="1.0" encoding="utf-8"?>
 <w:document xmlns:wpc="http://schemas.microsoft.com/office/word/2010/wordprocessingCanvas" xmlns:mo="http://schemas.microsoft.com/office/mac/office/2008/main" xmlns:mc="http://schemas.openxmlformats.org/markup-compatibility/2006" xmlns:mv="urn:schemas-microsoft-com:mac:vml" xmlns:o="urn:schemas-microsoft-com:office:office" xmlns:r="http://schemas.openxmlformats.org/officeDocument/2006/relationships" xmlns:m="http://schemas.openxmlformats.org/officeDocument/2006/math" xmlns:v="urn:schemas-microsoft-com:vml" xmlns:wp14="http://schemas.microsoft.com/office/word/2010/wordprocessingDrawing" xmlns:wp="http://schemas.openxmlformats.org/drawingml/2006/wordprocessingDrawing" xmlns:w10="urn:schemas-microsoft-com:office:word" xmlns:w="http://schemas.openxmlformats.org/wordprocessingml/2006/main" xmlns:w14="http://schemas.microsoft.com/office/word/2010/wordml" xmlns:wpg="http://schemas.microsoft.com/office/word/2010/wordprocessingGroup" xmlns:wpi="http://schemas.microsoft.com/office/word/2010/wordprocessingInk" xmlns:wne="http://schemas.microsoft.com/office/word/2006/wordml" xmlns:wps="http://schemas.microsoft.com/office/word/2010/wordprocessingShape" mc:Ignorable="w14 wp14">
   <w:body>
+    <w:p>
+      <w:pPr>
+        <w:jc w:val="left"/>
+      </w:pPr>
+      <w:r>
+        <w:rPr>
+          <w:b/>
+          <w:color w:val="1A477A"/>
+          <w:sz w:val="24"/>
+        </w:rPr>
+        <w:t>David Moreira — Consultoria BIM &amp; Tecnologia</w:t>
+      </w:r>
+    </w:p>
+    <w:p>
+      <w:pPr>
+        <w:jc w:val="left"/>
+      </w:pPr>
+      <w:r>
+        <w:rPr>
+          <w:color w:val="666666"/>
+          <w:sz w:val="18"/>
+        </w:rPr>
+        <w:t>contacto@umbral.dev | umbral.dev | Santiago, Chile</w:t>
+      </w:r>
+    </w:p>
     <w:p>
       <w:pPr>
         <w:jc w:val="right"/>
@@ -10,9 +35,9 @@
         <w:rPr>
           <w:b/>
           <w:color w:val="1A477A"/>
-          <w:sz w:val="40"/>
+          <w:sz w:val="44"/>
         </w:rPr>
-        <w:t>COTIZACIÓN</w:t>
+        <w:t>COTIZACION</w:t>
       </w:r>
     </w:p>
     <w:p>
@@ -28,6 +53,17 @@
       </w:r>
     </w:p>
     <w:p/>
+    <w:p>
+      <w:pPr>
+        <w:pStyle w:val="Heading2"/>
+      </w:pPr>
+      <w:r>
+        <w:rPr>
+          <w:color w:val="1A477A"/>
+        </w:rPr>
+        <w:t>Datos del Cliente</w:t>
+      </w:r>
+    </w:p>
     <w:tbl>
       <w:tblPr>
         <w:tblW w:type="auto" w:w="0"/>
@@ -44,9 +80,78 @@
             <w:tcW w:type="dxa" w:w="4320"/>
           </w:tcPr>
           <w:p>
+            <w:r/>
             <w:r>
               <w:rPr>
-                <w:sz w:val="22"/>
+                <w:rFonts w:ascii="Calibri" w:hAnsi="Calibri"/>
+                <w:b/>
+                <w:sz w:val="20"/>
+              </w:rPr>
+              <w:t>Empresa:</w:t>
+            </w:r>
+          </w:p>
+        </w:tc>
+        <w:tc>
+          <w:tcPr>
+            <w:tcW w:type="dxa" w:w="4320"/>
+          </w:tcPr>
+          <w:p>
+            <w:r/>
+            <w:r>
+              <w:rPr>
+                <w:rFonts w:ascii="Calibri" w:hAnsi="Calibri"/>
+                <w:sz w:val="20"/>
+              </w:rPr>
+              <w:t>{{ empresa_cliente }}</w:t>
+            </w:r>
+          </w:p>
+        </w:tc>
+      </w:tr>
+      <w:tr>
+        <w:tc>
+          <w:tcPr>
+            <w:tcW w:type="dxa" w:w="4320"/>
+          </w:tcPr>
+          <w:p>
+            <w:r/>
+            <w:r>
+              <w:rPr>
+                <w:rFonts w:ascii="Calibri" w:hAnsi="Calibri"/>
+                <w:b/>
+                <w:sz w:val="20"/>
+              </w:rPr>
+              <w:t>Contacto:</w:t>
+            </w:r>
+          </w:p>
+        </w:tc>
+        <w:tc>
+          <w:tcPr>
+            <w:tcW w:type="dxa" w:w="4320"/>
+          </w:tcPr>
+          <w:p>
+            <w:r/>
+            <w:r>
+              <w:rPr>
+                <w:rFonts w:ascii="Calibri" w:hAnsi="Calibri"/>
+                <w:sz w:val="20"/>
+              </w:rPr>
+              <w:t>{{ contacto_cliente }}</w:t>
+            </w:r>
+          </w:p>
+        </w:tc>
+      </w:tr>
+      <w:tr>
+        <w:tc>
+          <w:tcPr>
+            <w:tcW w:type="dxa" w:w="4320"/>
+          </w:tcPr>
+          <w:p>
+            <w:r/>
+            <w:r>
+              <w:rPr>
+                <w:rFonts w:ascii="Calibri" w:hAnsi="Calibri"/>
+                <w:b/>
+                <w:sz w:val="20"/>
               </w:rPr>
               <w:t>Proyecto:</w:t>
             </w:r>
@@ -57,9 +162,11 @@
             <w:tcW w:type="dxa" w:w="4320"/>
           </w:tcPr>
           <w:p>
+            <w:r/>
             <w:r>
               <w:rPr>
-                <w:sz w:val="22"/>
+                <w:rFonts w:ascii="Calibri" w:hAnsi="Calibri"/>
+                <w:sz w:val="20"/>
               </w:rPr>
               <w:t>{{ proyecto }}</w:t>
             </w:r>
@@ -72,11 +179,14 @@
             <w:tcW w:type="dxa" w:w="4320"/>
           </w:tcPr>
           <w:p>
+            <w:r/>
             <w:r>
               <w:rPr>
-                <w:sz w:val="22"/>
+                <w:rFonts w:ascii="Calibri" w:hAnsi="Calibri"/>
+                <w:b/>
+                <w:sz w:val="20"/>
               </w:rPr>
-              <w:t>Cliente:</w:t>
+              <w:t>Fecha:</w:t>
             </w:r>
           </w:p>
         </w:tc>
@@ -85,11 +195,13 @@
             <w:tcW w:type="dxa" w:w="4320"/>
           </w:tcPr>
           <w:p>
+            <w:r/>
             <w:r>
               <w:rPr>
-                <w:sz w:val="22"/>
+                <w:rFonts w:ascii="Calibri" w:hAnsi="Calibri"/>
+                <w:sz w:val="20"/>
               </w:rPr>
-              <w:t>{{ cliente }}</w:t>
+              <w:t>{{ fecha }}</w:t>
             </w:r>
           </w:p>
         </w:tc>
@@ -100,11 +212,14 @@
             <w:tcW w:type="dxa" w:w="4320"/>
           </w:tcPr>
           <w:p>
+            <w:r/>
             <w:r>
               <w:rPr>
-                <w:sz w:val="22"/>
+                <w:rFonts w:ascii="Calibri" w:hAnsi="Calibri"/>
+                <w:b/>
+                <w:sz w:val="20"/>
               </w:rPr>
-              <w:t>Fecha:</w:t>
+              <w:t>Validez:</w:t>
             </w:r>
           </w:p>
         </w:tc>
@@ -113,11 +228,13 @@
             <w:tcW w:type="dxa" w:w="4320"/>
           </w:tcPr>
           <w:p>
+            <w:r/>
             <w:r>
               <w:rPr>
-                <w:sz w:val="22"/>
+                <w:rFonts w:ascii="Calibri" w:hAnsi="Calibri"/>
+                <w:sz w:val="20"/>
               </w:rPr>
-              <w:t>{{ fecha }}</w:t>
+              <w:t>{{ vigencia }}</w:t>
             </w:r>
           </w:p>
         </w:tc>
@@ -126,19 +243,30 @@
     <w:p/>
     <w:p>
       <w:pPr>
-        <w:pStyle w:val="Heading1"/>
+        <w:pStyle w:val="Heading2"/>
       </w:pPr>
       <w:r>
-        <w:t>Detalle de Servicios</w:t>
+        <w:rPr>
+          <w:color w:val="1A477A"/>
+        </w:rPr>
+        <w:t>Objeto de la Cotizacion</w:t>
       </w:r>
     </w:p>
     <w:p>
       <w:r>
+        <w:t>{{ objeto_cotizacion }}</w:t>
+      </w:r>
+    </w:p>
+    <w:p/>
+    <w:p>
+      <w:pPr>
+        <w:pStyle w:val="Heading1"/>
+      </w:pPr>
+      <w:r>
         <w:rPr>
-          <w:color w:val="FFFFFF"/>
-          <w:sz w:val="2"/>
+          <w:color w:val="1A477A"/>
         </w:rPr>
-        <w:t>{%tr for servicio in servicios %}</w:t>
+        <w:t>Detalle de Servicios</w:t>
       </w:r>
     </w:p>
     <w:tbl>
@@ -149,77 +277,115 @@
         <w:tblLook w:firstColumn="1" w:firstRow="1" w:lastColumn="0" w:lastRow="0" w:noHBand="0" w:noVBand="1" w:val="04A0"/>
       </w:tblPr>
       <w:tblGrid>
-        <w:gridCol w:w="2160"/>
-        <w:gridCol w:w="2160"/>
-        <w:gridCol w:w="2160"/>
-        <w:gridCol w:w="2160"/>
+        <w:gridCol w:w="1728"/>
+        <w:gridCol w:w="1728"/>
+        <w:gridCol w:w="1728"/>
+        <w:gridCol w:w="1728"/>
+        <w:gridCol w:w="1728"/>
       </w:tblGrid>
       <w:tr>
         <w:tc>
           <w:tcPr>
-            <w:tcW w:type="dxa" w:w="2160"/>
+            <w:tcW w:type="dxa" w:w="680"/>
+            <w:shd w:fill="1A477A" w:val="clear"/>
           </w:tcPr>
           <w:p>
             <w:pPr>
               <w:jc w:val="center"/>
             </w:pPr>
+            <w:r/>
             <w:r>
               <w:rPr>
+                <w:rFonts w:ascii="Calibri" w:hAnsi="Calibri"/>
                 <w:b/>
+                <w:color w:val="FFFFFF"/>
                 <w:sz w:val="20"/>
               </w:rPr>
-              <w:t>Servicio</w:t>
+              <w:t>Item</w:t>
             </w:r>
           </w:p>
         </w:tc>
         <w:tc>
           <w:tcPr>
-            <w:tcW w:type="dxa" w:w="2160"/>
+            <w:tcW w:type="dxa" w:w="3969"/>
+            <w:shd w:fill="1A477A" w:val="clear"/>
           </w:tcPr>
           <w:p>
             <w:pPr>
               <w:jc w:val="center"/>
             </w:pPr>
+            <w:r/>
             <w:r>
               <w:rPr>
+                <w:rFonts w:ascii="Calibri" w:hAnsi="Calibri"/>
                 <w:b/>
+                <w:color w:val="FFFFFF"/>
                 <w:sz w:val="20"/>
               </w:rPr>
-              <w:t>Descripción</w:t>
+              <w:t>Descripcion</w:t>
             </w:r>
           </w:p>
         </w:tc>
         <w:tc>
           <w:tcPr>
-            <w:tcW w:type="dxa" w:w="2160"/>
+            <w:tcW w:type="dxa" w:w="850"/>
+            <w:shd w:fill="1A477A" w:val="clear"/>
           </w:tcPr>
           <w:p>
             <w:pPr>
               <w:jc w:val="center"/>
             </w:pPr>
+            <w:r/>
             <w:r>
               <w:rPr>
+                <w:rFonts w:ascii="Calibri" w:hAnsi="Calibri"/>
                 <w:b/>
+                <w:color w:val="FFFFFF"/>
                 <w:sz w:val="20"/>
               </w:rPr>
-              <w:t>Plazo</w:t>
+              <w:t>Hrs</w:t>
             </w:r>
           </w:p>
         </w:tc>
         <w:tc>
           <w:tcPr>
-            <w:tcW w:type="dxa" w:w="2160"/>
+            <w:tcW w:type="dxa" w:w="1417"/>
+            <w:shd w:fill="1A477A" w:val="clear"/>
           </w:tcPr>
           <w:p>
             <w:pPr>
               <w:jc w:val="center"/>
             </w:pPr>
+            <w:r/>
             <w:r>
               <w:rPr>
+                <w:rFonts w:ascii="Calibri" w:hAnsi="Calibri"/>
                 <w:b/>
+                <w:color w:val="FFFFFF"/>
                 <w:sz w:val="20"/>
               </w:rPr>
-              <w:t>Valor</w:t>
+              <w:t>Valor Unit.</w:t>
+            </w:r>
+          </w:p>
+        </w:tc>
+        <w:tc>
+          <w:tcPr>
+            <w:tcW w:type="dxa" w:w="1417"/>
+            <w:shd w:fill="1A477A" w:val="clear"/>
+          </w:tcPr>
+          <w:p>
+            <w:pPr>
+              <w:jc w:val="center"/>
+            </w:pPr>
+            <w:r/>
+            <w:r>
+              <w:rPr>
+                <w:rFonts w:ascii="Calibri" w:hAnsi="Calibri"/>
+                <w:b/>
+                <w:color w:val="FFFFFF"/>
+                <w:sz w:val="20"/>
+              </w:rPr>
+              <w:t>Total</w:t>
             </w:r>
           </w:p>
         </w:tc>
@@ -227,55 +393,399 @@
       <w:tr>
         <w:tc>
           <w:tcPr>
-            <w:tcW w:type="dxa" w:w="2160"/>
+            <w:tcW w:type="dxa" w:w="680"/>
           </w:tcPr>
           <w:p>
+            <w:r/>
             <w:r>
-              <w:t>{{ servicio.nombre }}</w:t>
+              <w:rPr>
+                <w:rFonts w:ascii="Calibri" w:hAnsi="Calibri"/>
+                <w:sz w:val="20"/>
+              </w:rPr>
+              <w:t>1</w:t>
             </w:r>
           </w:p>
         </w:tc>
         <w:tc>
           <w:tcPr>
-            <w:tcW w:type="dxa" w:w="2160"/>
+            <w:tcW w:type="dxa" w:w="3969"/>
           </w:tcPr>
           <w:p>
+            <w:r/>
             <w:r>
-              <w:t>{{ servicio.descripcion }}</w:t>
+              <w:rPr>
+                <w:rFonts w:ascii="Calibri" w:hAnsi="Calibri"/>
+                <w:sz w:val="20"/>
+              </w:rPr>
+              <w:t>Diagnostico BIM: relevamiento de procesos actuales, identificacion de brechas, recomendaciones</w:t>
             </w:r>
           </w:p>
         </w:tc>
         <w:tc>
           <w:tcPr>
-            <w:tcW w:type="dxa" w:w="2160"/>
+            <w:tcW w:type="dxa" w:w="850"/>
           </w:tcPr>
           <w:p>
+            <w:r/>
             <w:r>
-              <w:t>{{ servicio.plazo }}</w:t>
+              <w:rPr>
+                <w:rFonts w:ascii="Calibri" w:hAnsi="Calibri"/>
+                <w:sz w:val="20"/>
+              </w:rPr>
+              <w:t>{{ hrs_diagnostico }}</w:t>
             </w:r>
           </w:p>
         </w:tc>
         <w:tc>
           <w:tcPr>
-            <w:tcW w:type="dxa" w:w="2160"/>
+            <w:tcW w:type="dxa" w:w="1417"/>
           </w:tcPr>
           <w:p>
+            <w:r/>
             <w:r>
-              <w:t>{{ servicio.valor }}</w:t>
+              <w:rPr>
+                <w:rFonts w:ascii="Calibri" w:hAnsi="Calibri"/>
+                <w:sz w:val="20"/>
+              </w:rPr>
+              <w:t>{{ valor_diagnostico }}</w:t>
+            </w:r>
+          </w:p>
+        </w:tc>
+        <w:tc>
+          <w:tcPr>
+            <w:tcW w:type="dxa" w:w="1417"/>
+          </w:tcPr>
+          <w:p>
+            <w:r/>
+            <w:r>
+              <w:rPr>
+                <w:rFonts w:ascii="Calibri" w:hAnsi="Calibri"/>
+                <w:sz w:val="20"/>
+              </w:rPr>
+              <w:t>{{ total_diagnostico }}</w:t>
+            </w:r>
+          </w:p>
+        </w:tc>
+      </w:tr>
+      <w:tr>
+        <w:tc>
+          <w:tcPr>
+            <w:tcW w:type="dxa" w:w="680"/>
+            <w:shd w:fill="F2F6FA" w:val="clear"/>
+          </w:tcPr>
+          <w:p>
+            <w:r/>
+            <w:r>
+              <w:rPr>
+                <w:rFonts w:ascii="Calibri" w:hAnsi="Calibri"/>
+                <w:sz w:val="20"/>
+              </w:rPr>
+              <w:t>2</w:t>
+            </w:r>
+          </w:p>
+        </w:tc>
+        <w:tc>
+          <w:tcPr>
+            <w:tcW w:type="dxa" w:w="3969"/>
+            <w:shd w:fill="F2F6FA" w:val="clear"/>
+          </w:tcPr>
+          <w:p>
+            <w:r/>
+            <w:r>
+              <w:rPr>
+                <w:rFonts w:ascii="Calibri" w:hAnsi="Calibri"/>
+                <w:sz w:val="20"/>
+              </w:rPr>
+              <w:t>BIM Execution Plan (BEP): definicion de usos BIM, roles, entregables, matriz de responsabilidades</w:t>
+            </w:r>
+          </w:p>
+        </w:tc>
+        <w:tc>
+          <w:tcPr>
+            <w:tcW w:type="dxa" w:w="850"/>
+            <w:shd w:fill="F2F6FA" w:val="clear"/>
+          </w:tcPr>
+          <w:p>
+            <w:r/>
+            <w:r>
+              <w:rPr>
+                <w:rFonts w:ascii="Calibri" w:hAnsi="Calibri"/>
+                <w:sz w:val="20"/>
+              </w:rPr>
+              <w:t>{{ hrs_bep }}</w:t>
+            </w:r>
+          </w:p>
+        </w:tc>
+        <w:tc>
+          <w:tcPr>
+            <w:tcW w:type="dxa" w:w="1417"/>
+            <w:shd w:fill="F2F6FA" w:val="clear"/>
+          </w:tcPr>
+          <w:p>
+            <w:r/>
+            <w:r>
+              <w:rPr>
+                <w:rFonts w:ascii="Calibri" w:hAnsi="Calibri"/>
+                <w:sz w:val="20"/>
+              </w:rPr>
+              <w:t>{{ valor_bep }}</w:t>
+            </w:r>
+          </w:p>
+        </w:tc>
+        <w:tc>
+          <w:tcPr>
+            <w:tcW w:type="dxa" w:w="1417"/>
+            <w:shd w:fill="F2F6FA" w:val="clear"/>
+          </w:tcPr>
+          <w:p>
+            <w:r/>
+            <w:r>
+              <w:rPr>
+                <w:rFonts w:ascii="Calibri" w:hAnsi="Calibri"/>
+                <w:sz w:val="20"/>
+              </w:rPr>
+              <w:t>{{ total_bep }}</w:t>
+            </w:r>
+          </w:p>
+        </w:tc>
+      </w:tr>
+      <w:tr>
+        <w:tc>
+          <w:tcPr>
+            <w:tcW w:type="dxa" w:w="680"/>
+          </w:tcPr>
+          <w:p>
+            <w:r/>
+            <w:r>
+              <w:rPr>
+                <w:rFonts w:ascii="Calibri" w:hAnsi="Calibri"/>
+                <w:sz w:val="20"/>
+              </w:rPr>
+              <w:t>3</w:t>
+            </w:r>
+          </w:p>
+        </w:tc>
+        <w:tc>
+          <w:tcPr>
+            <w:tcW w:type="dxa" w:w="3969"/>
+          </w:tcPr>
+          <w:p>
+            <w:r/>
+            <w:r>
+              <w:rPr>
+                <w:rFonts w:ascii="Calibri" w:hAnsi="Calibri"/>
+                <w:sz w:val="20"/>
+              </w:rPr>
+              <w:t>Coordinacion 3D: federacion de modelos, clash detection, reportes semanales de interferencias</w:t>
+            </w:r>
+          </w:p>
+        </w:tc>
+        <w:tc>
+          <w:tcPr>
+            <w:tcW w:type="dxa" w:w="850"/>
+          </w:tcPr>
+          <w:p>
+            <w:r/>
+            <w:r>
+              <w:rPr>
+                <w:rFonts w:ascii="Calibri" w:hAnsi="Calibri"/>
+                <w:sz w:val="20"/>
+              </w:rPr>
+              <w:t>{{ hrs_coordinacion }}</w:t>
+            </w:r>
+          </w:p>
+        </w:tc>
+        <w:tc>
+          <w:tcPr>
+            <w:tcW w:type="dxa" w:w="1417"/>
+          </w:tcPr>
+          <w:p>
+            <w:r/>
+            <w:r>
+              <w:rPr>
+                <w:rFonts w:ascii="Calibri" w:hAnsi="Calibri"/>
+                <w:sz w:val="20"/>
+              </w:rPr>
+              <w:t>{{ valor_coordinacion }}</w:t>
+            </w:r>
+          </w:p>
+        </w:tc>
+        <w:tc>
+          <w:tcPr>
+            <w:tcW w:type="dxa" w:w="1417"/>
+          </w:tcPr>
+          <w:p>
+            <w:r/>
+            <w:r>
+              <w:rPr>
+                <w:rFonts w:ascii="Calibri" w:hAnsi="Calibri"/>
+                <w:sz w:val="20"/>
+              </w:rPr>
+              <w:t>{{ total_coordinacion }}</w:t>
+            </w:r>
+          </w:p>
+        </w:tc>
+      </w:tr>
+      <w:tr>
+        <w:tc>
+          <w:tcPr>
+            <w:tcW w:type="dxa" w:w="680"/>
+            <w:shd w:fill="F2F6FA" w:val="clear"/>
+          </w:tcPr>
+          <w:p>
+            <w:r/>
+            <w:r>
+              <w:rPr>
+                <w:rFonts w:ascii="Calibri" w:hAnsi="Calibri"/>
+                <w:sz w:val="20"/>
+              </w:rPr>
+              <w:t>4</w:t>
+            </w:r>
+          </w:p>
+        </w:tc>
+        <w:tc>
+          <w:tcPr>
+            <w:tcW w:type="dxa" w:w="3969"/>
+            <w:shd w:fill="F2F6FA" w:val="clear"/>
+          </w:tcPr>
+          <w:p>
+            <w:r/>
+            <w:r>
+              <w:rPr>
+                <w:rFonts w:ascii="Calibri" w:hAnsi="Calibri"/>
+                <w:sz w:val="20"/>
+              </w:rPr>
+              <w:t>Capacitacion: workshops de Revit, Navisworks y flujos BIM para el equipo del proyecto</w:t>
+            </w:r>
+          </w:p>
+        </w:tc>
+        <w:tc>
+          <w:tcPr>
+            <w:tcW w:type="dxa" w:w="850"/>
+            <w:shd w:fill="F2F6FA" w:val="clear"/>
+          </w:tcPr>
+          <w:p>
+            <w:r/>
+            <w:r>
+              <w:rPr>
+                <w:rFonts w:ascii="Calibri" w:hAnsi="Calibri"/>
+                <w:sz w:val="20"/>
+              </w:rPr>
+              <w:t>{{ hrs_capacitacion }}</w:t>
+            </w:r>
+          </w:p>
+        </w:tc>
+        <w:tc>
+          <w:tcPr>
+            <w:tcW w:type="dxa" w:w="1417"/>
+            <w:shd w:fill="F2F6FA" w:val="clear"/>
+          </w:tcPr>
+          <w:p>
+            <w:r/>
+            <w:r>
+              <w:rPr>
+                <w:rFonts w:ascii="Calibri" w:hAnsi="Calibri"/>
+                <w:sz w:val="20"/>
+              </w:rPr>
+              <w:t>{{ valor_capacitacion }}</w:t>
+            </w:r>
+          </w:p>
+        </w:tc>
+        <w:tc>
+          <w:tcPr>
+            <w:tcW w:type="dxa" w:w="1417"/>
+            <w:shd w:fill="F2F6FA" w:val="clear"/>
+          </w:tcPr>
+          <w:p>
+            <w:r/>
+            <w:r>
+              <w:rPr>
+                <w:rFonts w:ascii="Calibri" w:hAnsi="Calibri"/>
+                <w:sz w:val="20"/>
+              </w:rPr>
+              <w:t>{{ total_capacitacion }}</w:t>
+            </w:r>
+          </w:p>
+        </w:tc>
+      </w:tr>
+      <w:tr>
+        <w:tc>
+          <w:tcPr>
+            <w:tcW w:type="dxa" w:w="680"/>
+          </w:tcPr>
+          <w:p>
+            <w:r/>
+            <w:r>
+              <w:rPr>
+                <w:rFonts w:ascii="Calibri" w:hAnsi="Calibri"/>
+                <w:sz w:val="20"/>
+              </w:rPr>
+              <w:t>5</w:t>
+            </w:r>
+          </w:p>
+        </w:tc>
+        <w:tc>
+          <w:tcPr>
+            <w:tcW w:type="dxa" w:w="3969"/>
+          </w:tcPr>
+          <w:p>
+            <w:r/>
+            <w:r>
+              <w:rPr>
+                <w:rFonts w:ascii="Calibri" w:hAnsi="Calibri"/>
+                <w:sz w:val="20"/>
+              </w:rPr>
+              <w:t>Soporte continuo: asesoria remota, revision de modelos, resolucion de consultas tecnicas</w:t>
+            </w:r>
+          </w:p>
+        </w:tc>
+        <w:tc>
+          <w:tcPr>
+            <w:tcW w:type="dxa" w:w="850"/>
+          </w:tcPr>
+          <w:p>
+            <w:r/>
+            <w:r>
+              <w:rPr>
+                <w:rFonts w:ascii="Calibri" w:hAnsi="Calibri"/>
+                <w:sz w:val="20"/>
+              </w:rPr>
+              <w:t>{{ hrs_soporte }}</w:t>
+            </w:r>
+          </w:p>
+        </w:tc>
+        <w:tc>
+          <w:tcPr>
+            <w:tcW w:type="dxa" w:w="1417"/>
+          </w:tcPr>
+          <w:p>
+            <w:r/>
+            <w:r>
+              <w:rPr>
+                <w:rFonts w:ascii="Calibri" w:hAnsi="Calibri"/>
+                <w:sz w:val="20"/>
+              </w:rPr>
+              <w:t>{{ valor_soporte }}</w:t>
+            </w:r>
+          </w:p>
+        </w:tc>
+        <w:tc>
+          <w:tcPr>
+            <w:tcW w:type="dxa" w:w="1417"/>
+          </w:tcPr>
+          <w:p>
+            <w:r/>
+            <w:r>
+              <w:rPr>
+                <w:rFonts w:ascii="Calibri" w:hAnsi="Calibri"/>
+                <w:sz w:val="20"/>
+              </w:rPr>
+              <w:t>{{ total_soporte }}</w:t>
             </w:r>
           </w:p>
         </w:tc>
       </w:tr>
     </w:tbl>
-    <w:p>
-      <w:r>
-        <w:rPr>
-          <w:color w:val="FFFFFF"/>
-          <w:sz w:val="2"/>
-        </w:rPr>
-        <w:t>{%tr endfor %}</w:t>
-      </w:r>
-    </w:p>
     <w:p/>
     <w:tbl>
       <w:tblPr>
@@ -296,7 +806,12 @@
             <w:pPr>
               <w:jc w:val="right"/>
             </w:pPr>
+            <w:r/>
             <w:r>
+              <w:rPr>
+                <w:rFonts w:ascii="Calibri" w:hAnsi="Calibri"/>
+                <w:sz w:val="22"/>
+              </w:rPr>
               <w:t>Subtotal:</w:t>
             </w:r>
           </w:p>
@@ -309,7 +824,12 @@
             <w:pPr>
               <w:jc w:val="right"/>
             </w:pPr>
+            <w:r/>
             <w:r>
+              <w:rPr>
+                <w:rFonts w:ascii="Calibri" w:hAnsi="Calibri"/>
+                <w:sz w:val="22"/>
+              </w:rPr>
               <w:t>{{ subtotal }}</w:t>
             </w:r>
           </w:p>
@@ -324,8 +844,13 @@
             <w:pPr>
               <w:jc w:val="right"/>
             </w:pPr>
+            <w:r/>
             <w:r>
-              <w:t>IVA:</w:t>
+              <w:rPr>
+                <w:rFonts w:ascii="Calibri" w:hAnsi="Calibri"/>
+                <w:sz w:val="22"/>
+              </w:rPr>
+              <w:t>IVA (19%):</w:t>
             </w:r>
           </w:p>
         </w:tc>
@@ -337,7 +862,12 @@
             <w:pPr>
               <w:jc w:val="right"/>
             </w:pPr>
+            <w:r/>
             <w:r>
+              <w:rPr>
+                <w:rFonts w:ascii="Calibri" w:hAnsi="Calibri"/>
+                <w:sz w:val="22"/>
+              </w:rPr>
               <w:t>{{ iva }}</w:t>
             </w:r>
           </w:p>
@@ -352,7 +882,13 @@
             <w:pPr>
               <w:jc w:val="right"/>
             </w:pPr>
+            <w:r/>
             <w:r>
+              <w:rPr>
+                <w:rFonts w:ascii="Calibri" w:hAnsi="Calibri"/>
+                <w:b/>
+                <w:sz w:val="22"/>
+              </w:rPr>
               <w:t>TOTAL:</w:t>
             </w:r>
           </w:p>
@@ -365,7 +901,14 @@
             <w:pPr>
               <w:jc w:val="right"/>
             </w:pPr>
+            <w:r/>
             <w:r>
+              <w:rPr>
+                <w:rFonts w:ascii="Calibri" w:hAnsi="Calibri"/>
+                <w:b/>
+                <w:color w:val="1A477A"/>
+                <w:sz w:val="22"/>
+              </w:rPr>
               <w:t>{{ total }}</w:t>
             </w:r>
           </w:p>
@@ -378,20 +921,216 @@
         <w:pStyle w:val="Heading2"/>
       </w:pPr>
       <w:r>
+        <w:rPr>
+          <w:color w:val="1A477A"/>
+        </w:rPr>
         <w:t>Condiciones</w:t>
       </w:r>
     </w:p>
     <w:p>
+      <w:pPr>
+        <w:pStyle w:val="ListBullet"/>
+      </w:pPr>
       <w:r>
-        <w:t>Vigencia de la cotización: {{ vigencia }}</w:t>
+        <w:t>Validez de la cotizacion: {{ vigencia }} desde la fecha de emision.</w:t>
+      </w:r>
+    </w:p>
+    <w:p>
+      <w:pPr>
+        <w:pStyle w:val="ListBullet"/>
+      </w:pPr>
+      <w:r>
+        <w:t>Forma de pago: {{ condiciones_pago }}</w:t>
+      </w:r>
+    </w:p>
+    <w:p>
+      <w:pPr>
+        <w:pStyle w:val="ListBullet"/>
+      </w:pPr>
+      <w:r>
+        <w:t>Los valores estan expresados en {{ moneda }}.</w:t>
+      </w:r>
+    </w:p>
+    <w:p>
+      <w:pPr>
+        <w:pStyle w:val="ListBullet"/>
+      </w:pPr>
+      <w:r>
+        <w:t>Plazo estimado de ejecucion: {{ plazo_ejecucion }}.</w:t>
+      </w:r>
+    </w:p>
+    <w:p>
+      <w:pPr>
+        <w:pStyle w:val="ListBullet"/>
+      </w:pPr>
+      <w:r>
+        <w:t>Esta cotizacion no incluye: {{ exclusiones }}.</w:t>
+      </w:r>
+    </w:p>
+    <w:p>
+      <w:pPr>
+        <w:pStyle w:val="ListBullet"/>
+      </w:pPr>
+      <w:r>
+        <w:t>Los precios pueden ajustarse si el alcance cambia respecto a lo descrito en esta cotizacion.</w:t>
+      </w:r>
+    </w:p>
+    <w:p/>
+    <w:p>
+      <w:r>
+        <w:t>{{ notas_adicionales }}</w:t>
+      </w:r>
+    </w:p>
+    <w:p/>
+    <w:p>
+      <w:pPr>
+        <w:pStyle w:val="Heading2"/>
+      </w:pPr>
+      <w:r>
+        <w:rPr>
+          <w:color w:val="1A477A"/>
+        </w:rPr>
+        <w:t>Aceptacion</w:t>
       </w:r>
     </w:p>
     <w:p>
       <w:r>
-        <w:t>{{ notas }}</w:t>
+        <w:t>Acepto los terminos y condiciones de esta cotizacion:</w:t>
       </w:r>
     </w:p>
     <w:p/>
+    <w:tbl>
+      <w:tblPr>
+        <w:tblW w:type="auto" w:w="0"/>
+        <w:jc w:val="center"/>
+        <w:tblLook w:firstColumn="1" w:firstRow="1" w:lastColumn="0" w:lastRow="0" w:noHBand="0" w:noVBand="1" w:val="04A0"/>
+      </w:tblPr>
+      <w:tblGrid>
+        <w:gridCol w:w="4320"/>
+        <w:gridCol w:w="4320"/>
+      </w:tblGrid>
+      <w:tr>
+        <w:tc>
+          <w:tcPr>
+            <w:tcW w:type="dxa" w:w="4320"/>
+          </w:tcPr>
+          <w:p>
+            <w:pPr>
+              <w:jc w:val="center"/>
+            </w:pPr>
+            <w:r>
+              <w:rPr>
+                <w:rFonts w:ascii="Calibri" w:hAnsi="Calibri"/>
+                <w:sz w:val="20"/>
+              </w:rPr>
+              <w:t>________________________</w:t>
+            </w:r>
+          </w:p>
+        </w:tc>
+        <w:tc>
+          <w:tcPr>
+            <w:tcW w:type="dxa" w:w="4320"/>
+          </w:tcPr>
+          <w:p>
+            <w:pPr>
+              <w:jc w:val="center"/>
+            </w:pPr>
+            <w:r>
+              <w:rPr>
+                <w:rFonts w:ascii="Calibri" w:hAnsi="Calibri"/>
+                <w:sz w:val="20"/>
+              </w:rPr>
+              <w:t>________________________</w:t>
+            </w:r>
+          </w:p>
+        </w:tc>
+      </w:tr>
+      <w:tr>
+        <w:tc>
+          <w:tcPr>
+            <w:tcW w:type="dxa" w:w="4320"/>
+          </w:tcPr>
+          <w:p>
+            <w:pPr>
+              <w:jc w:val="center"/>
+            </w:pPr>
+            <w:r>
+              <w:rPr>
+                <w:rFonts w:ascii="Calibri" w:hAnsi="Calibri"/>
+                <w:sz w:val="20"/>
+              </w:rPr>
+              <w:t>David Moreira Mercado</w:t>
+            </w:r>
+          </w:p>
+        </w:tc>
+        <w:tc>
+          <w:tcPr>
+            <w:tcW w:type="dxa" w:w="4320"/>
+          </w:tcPr>
+          <w:p>
+            <w:pPr>
+              <w:jc w:val="center"/>
+            </w:pPr>
+            <w:r>
+              <w:rPr>
+                <w:rFonts w:ascii="Calibri" w:hAnsi="Calibri"/>
+                <w:sz w:val="20"/>
+              </w:rPr>
+              <w:t>{{ nombre_cliente }}</w:t>
+            </w:r>
+          </w:p>
+        </w:tc>
+      </w:tr>
+      <w:tr>
+        <w:tc>
+          <w:tcPr>
+            <w:tcW w:type="dxa" w:w="4320"/>
+          </w:tcPr>
+          <w:p>
+            <w:pPr>
+              <w:jc w:val="center"/>
+            </w:pPr>
+            <w:r>
+              <w:rPr>
+                <w:rFonts w:ascii="Calibri" w:hAnsi="Calibri"/>
+                <w:sz w:val="20"/>
+              </w:rPr>
+              <w:t>Consultor BIM</w:t>
+            </w:r>
+          </w:p>
+        </w:tc>
+        <w:tc>
+          <w:tcPr>
+            <w:tcW w:type="dxa" w:w="4320"/>
+          </w:tcPr>
+          <w:p>
+            <w:pPr>
+              <w:jc w:val="center"/>
+            </w:pPr>
+            <w:r>
+              <w:rPr>
+                <w:rFonts w:ascii="Calibri" w:hAnsi="Calibri"/>
+                <w:sz w:val="20"/>
+              </w:rPr>
+              <w:t>{{ cargo_cliente }}</w:t>
+            </w:r>
+          </w:p>
+        </w:tc>
+      </w:tr>
+    </w:tbl>
+    <w:p/>
+    <w:p>
+      <w:pPr>
+        <w:jc w:val="center"/>
+      </w:pPr>
+      <w:r>
+        <w:rPr>
+          <w:color w:val="666666"/>
+          <w:sz w:val="20"/>
+        </w:rPr>
+        <w:t>David Moreira — Consultoria BIM &amp; Tecnologia</w:t>
+      </w:r>
+    </w:p>
     <w:p>
       <w:pPr>
         <w:jc w:val="center"/>
@@ -401,7 +1140,7 @@
           <w:color w:val="999999"/>
           <w:sz w:val="18"/>
         </w:rPr>
-        <w:t>David — Consultoría BIM &amp; Tecnología | contacto@umbral.dev</w:t>
+        <w:t>contacto@umbral.dev | umbral.dev</w:t>
       </w:r>
     </w:p>
     <w:sectPr>

</xml_diff>